<commit_message>
Redline: show the compute-sourcing paragraph as a whole-paragraph replacement for readability
Co-Authored-By: Claude Fable 5.1 <noreply@anthropic.com>
Claude-Session: https://claude.ai/code/session_01U5F8Hi7Hqza7DMQwNg8fd6
</commit_message>
<xml_diff>
--- a/output/Q3_2026_Anthropic_S-1_note_2900w_CLEAN.docx
+++ b/output/Q3_2026_Anthropic_S-1_note_2900w_CLEAN.docx
@@ -4710,97 +4710,7 @@
           <w:iCs w:val="0"/>
           <w:color w:val="auto"/>
         </w:rPr>
-        <w:t xml:space="preserve">Anthropic </w:t>
-      </w:r>
-      <w:r>
-        <w:rPr>
-          <w:rStyle w:val="IntenseEmphasis"/>
-          <w:rFonts w:eastAsiaTheme="majorEastAsia" w:cstheme="minorHAnsi"/>
-          <w:i w:val="0"/>
-          <w:iCs w:val="0"/>
-          <w:color w:val="auto"/>
-        </w:rPr>
-        <w:t xml:space="preserve">now sources compute across several layers of the stack, from the hyperscalers (</w:t>
-      </w:r>
-      <w:r>
-        <w:rPr>
-          <w:rStyle w:val="IntenseEmphasis"/>
-          <w:rFonts w:eastAsiaTheme="majorEastAsia" w:cstheme="minorHAnsi"/>
-          <w:i w:val="0"/>
-          <w:iCs w:val="0"/>
-          <w:color w:val="auto"/>
-        </w:rPr>
-        <w:t xml:space="preserve">up to 5 gigawatts with Amazon, 5 gigawatts with Google and Broadcom, </w:t>
-      </w:r>
-      <w:r>
-        <w:rPr>
-          <w:rStyle w:val="IntenseEmphasis"/>
-          <w:rFonts w:eastAsiaTheme="majorEastAsia" w:cstheme="minorHAnsi"/>
-          <w:i w:val="0"/>
-          <w:iCs w:val="0"/>
-          <w:color w:val="auto"/>
-        </w:rPr>
-        <w:t xml:space="preserve">and </w:t>
-      </w:r>
-      <w:r>
-        <w:rPr>
-          <w:rStyle w:val="IntenseEmphasis"/>
-          <w:rFonts w:eastAsiaTheme="majorEastAsia" w:cstheme="minorHAnsi"/>
-          <w:i w:val="0"/>
-          <w:iCs w:val="0"/>
-          <w:color w:val="auto"/>
-        </w:rPr>
-        <w:t xml:space="preserve">up to 1 gigawatt </w:t>
-      </w:r>
-      <w:r>
-        <w:rPr>
-          <w:rStyle w:val="IntenseEmphasis"/>
-          <w:rFonts w:eastAsiaTheme="majorEastAsia" w:cstheme="minorHAnsi"/>
-          <w:i w:val="0"/>
-          <w:iCs w:val="0"/>
-          <w:color w:val="auto"/>
-        </w:rPr>
-        <w:t xml:space="preserve">with Azure</w:t>
-      </w:r>
-      <w:r>
-        <w:rPr>
-          <w:rStyle w:val="IntenseEmphasis"/>
-          <w:rFonts w:eastAsiaTheme="majorEastAsia" w:cstheme="minorHAnsi"/>
-          <w:i w:val="0"/>
-          <w:iCs w:val="0"/>
-          <w:color w:val="auto"/>
-        </w:rPr>
-        <w:t xml:space="preserve"> and Nvidia</w:t>
-      </w:r>
-      <w:r>
-        <w:rPr>
-          <w:rStyle w:val="IntenseEmphasis"/>
-          <w:rFonts w:eastAsiaTheme="majorEastAsia" w:cstheme="minorHAnsi"/>
-          <w:i w:val="0"/>
-          <w:iCs w:val="0"/>
-          <w:color w:val="auto"/>
-        </w:rPr>
-        <w:t xml:space="preserve">) to neocloud and data-center partners (Fluidstack’s</w:t>
-      </w:r>
-      <w:r>
-        <w:rPr>
-          <w:rStyle w:val="IntenseEmphasis"/>
-          <w:rFonts w:eastAsiaTheme="majorEastAsia" w:cstheme="minorHAnsi"/>
-          <w:i w:val="0"/>
-          <w:iCs w:val="0"/>
-          <w:color w:val="auto"/>
-        </w:rPr>
-        <w:t xml:space="preserve"> $50 billion U.S. infrastructure program</w:t>
-      </w:r>
-      <w:r>
-        <w:rPr>
-          <w:rStyle w:val="IntenseEmphasis"/>
-          <w:rFonts w:eastAsiaTheme="majorEastAsia" w:cstheme="minorHAnsi"/>
-          <w:i w:val="0"/>
-          <w:iCs w:val="0"/>
-          <w:color w:val="auto"/>
-        </w:rPr>
-        <w:t xml:space="preserve">, Nscale, Lambda, and SpaceX).</w:t>
+        <w:t xml:space="preserve">Anthropic now sources compute across several layers of the stack, from the hyperscalers (up to 5 gigawatts with Amazon, 5 gigawatts with Google and Broadcom, and up to 1 gigawatt with Azure and Nvidia) to neocloud and data-center partners (Fluidstack’s $50 billion U.S. infrastructure program, Nscale, Lambda, and SpaceX).</w:t>
       </w:r>
     </w:p>
     <w:p>

</xml_diff>